<commit_message>
repositrio actualizado en docmentacion
</commit_message>
<xml_diff>
--- a/Documentacion_Proyecto.docx
+++ b/Documentacion_Proyecto.docx
@@ -14,13 +14,7 @@
         <w:rPr>
           <w:lang w:val="es-ES"/>
         </w:rPr>
-        <w:t xml:space="preserve">Documentación </w:t>
-      </w:r>
-      <w:r>
-        <w:rPr>
-          <w:lang w:val="es-ES"/>
-        </w:rPr>
-        <w:t>Proyecto Final</w:t>
+        <w:t>Documentación Proyecto Final</w:t>
       </w:r>
       <w:r>
         <w:rPr>
@@ -279,13 +273,7 @@
         <w:rPr>
           <w:lang w:val="es-ES"/>
         </w:rPr>
-        <w:t xml:space="preserve"> aborda la necesidad de una</w:t>
-      </w:r>
-      <w:r>
-        <w:rPr>
-          <w:lang w:val="es-ES"/>
-        </w:rPr>
-        <w:t xml:space="preserve"> pastelería </w:t>
+        <w:t xml:space="preserve"> aborda la necesidad de una pastelería </w:t>
       </w:r>
       <w:r>
         <w:rPr>
@@ -297,13 +285,7 @@
         <w:rPr>
           <w:lang w:val="es-ES"/>
         </w:rPr>
-        <w:t>de consoli</w:t>
-      </w:r>
-      <w:r>
-        <w:rPr>
-          <w:lang w:val="es-ES"/>
-        </w:rPr>
-        <w:t>dar y analizar tanto su historial profundo de ventas como el pulso operativo de sus tiendas en tiempo exacto. Para lograrlo, se diseñó e implementó una Arquitectura Lambda completa.</w:t>
+        <w:t>de consolidar y analizar tanto su historial profundo de ventas como el pulso operativo de sus tiendas en tiempo exacto. Para lograrlo, se diseñó e implementó una Arquitectura Lambda completa.</w:t>
       </w:r>
       <w:r>
         <w:rPr>
@@ -1078,13 +1060,7 @@
         <w:rPr>
           <w:lang w:val="es-ES"/>
         </w:rPr>
-        <w:t xml:space="preserve"> e intentar graficar, la cuenta de filas regresaba "0". Problema: Confusión en los límites entre la capa de infraestructura y la de servicio; las tablas existían, pero no se había </w:t>
-      </w:r>
-      <w:r>
-        <w:rPr>
-          <w:lang w:val="es-ES"/>
-        </w:rPr>
-        <w:t xml:space="preserve">hecho el </w:t>
+        <w:t xml:space="preserve"> e intentar graficar, la cuenta de filas regresaba "0". Problema: Confusión en los límites entre la capa de infraestructura y la de servicio; las tablas existían, pero no se había hecho el </w:t>
       </w:r>
       <w:proofErr w:type="spellStart"/>
       <w:r>
@@ -1098,13 +1074,7 @@
         <w:rPr>
           <w:lang w:val="es-ES"/>
         </w:rPr>
-        <w:t xml:space="preserve"> al DAG ni </w:t>
-      </w:r>
-      <w:r>
-        <w:rPr>
-          <w:lang w:val="es-ES"/>
-        </w:rPr>
-        <w:t xml:space="preserve">ejecutado los scripts generadores para Kafka. Solución: Iniciar los scripts </w:t>
+        <w:t xml:space="preserve"> al DAG ni ejecutado los scripts generadores para Kafka. Solución: Iniciar los scripts </w:t>
       </w:r>
       <w:proofErr w:type="spellStart"/>
       <w:r>

</xml_diff>